<commit_message>
docs(report): embed live screenshots (hotelsim, Airflow DAG, Superset) into integrated report
scripts/report/screenshots.py captures the running stack via headless system
Chrome (Playwright): hotel-site simulator, Airflow DAG graph (all tasks success),
Superset dashboard. Embedded into chapters 13.3b / 13.5b / 13.6 of
NextStay_Report_Integrated.docx. Screenshots dir gitignored (regenerable).
</commit_message>
<xml_diff>
--- a/docs/report/NextStay_Report_Integrated.docx
+++ b/docs/report/NextStay_Report_Integrated.docx
@@ -12710,6 +12710,58 @@
     </w:p>
     <w:p/>
     <w:p>
+      <w:pPr>
+        <w:jc w:val="center"/>
+      </w:pPr>
+      <w:r>
+        <w:drawing>
+          <wp:inline xmlns:a="http://schemas.openxmlformats.org/drawingml/2006/main" xmlns:pic="http://schemas.openxmlformats.org/drawingml/2006/picture">
+            <wp:extent cx="5669280" cy="3543300"/>
+            <wp:docPr id="1952843050" name="Picture 1952843050"/>
+            <wp:cNvGraphicFramePr>
+              <a:graphicFrameLocks noChangeAspect="1"/>
+            </wp:cNvGraphicFramePr>
+            <a:graphic>
+              <a:graphicData uri="http://schemas.openxmlformats.org/drawingml/2006/picture">
+                <pic:pic>
+                  <pic:nvPicPr>
+                    <pic:cNvPr id="0" name="hotelsim.png"/>
+                    <pic:cNvPicPr/>
+                  </pic:nvPicPr>
+                  <pic:blipFill>
+                    <a:blip r:embed="rId16"/>
+                    <a:stretch>
+                      <a:fillRect/>
+                    </a:stretch>
+                  </pic:blipFill>
+                  <pic:spPr>
+                    <a:xfrm>
+                      <a:off x="0" y="0"/>
+                      <a:ext cx="5669280" cy="3543300"/>
+                    </a:xfrm>
+                    <a:prstGeom prst="rect"/>
+                  </pic:spPr>
+                </pic:pic>
+              </a:graphicData>
+            </a:graphic>
+          </wp:inline>
+        </w:drawing>
+      </w:r>
+    </w:p>
+    <w:p>
+      <w:pPr>
+        <w:jc w:val="center"/>
+      </w:pPr>
+      <w:r>
+        <w:rPr>
+          <w:i/>
+          <w:sz w:val="18"/>
+        </w:rPr>
+        <w:t>Figure 13.3b — Hotel-site simulator (live): rooms and bookings; PMS cancellations show as 'cancelled'.</w:t>
+      </w:r>
+    </w:p>
+    <w:p/>
+    <w:p>
       <w:r>
         <w:rPr>
           <w:b w:val="0"/>
@@ -12734,7 +12786,7 @@
         <w:drawing>
           <wp:inline xmlns:a="http://schemas.openxmlformats.org/drawingml/2006/main" xmlns:pic="http://schemas.openxmlformats.org/drawingml/2006/picture">
             <wp:extent cx="5486400" cy="1171777"/>
-            <wp:docPr id="1952843050" name="Picture 1952843050"/>
+            <wp:docPr id="1952843051" name="Picture 1952843051"/>
             <wp:cNvGraphicFramePr>
               <a:graphicFrameLocks noChangeAspect="1"/>
             </wp:cNvGraphicFramePr>
@@ -12746,7 +12798,7 @@
                     <pic:cNvPicPr/>
                   </pic:nvPicPr>
                   <pic:blipFill>
-                    <a:blip r:embed="rId16"/>
+                    <a:blip r:embed="rId17"/>
                     <a:stretch>
                       <a:fillRect/>
                     </a:stretch>
@@ -12803,7 +12855,7 @@
         <w:drawing>
           <wp:inline xmlns:a="http://schemas.openxmlformats.org/drawingml/2006/main" xmlns:pic="http://schemas.openxmlformats.org/drawingml/2006/picture">
             <wp:extent cx="5486400" cy="581011"/>
-            <wp:docPr id="1952843051" name="Picture 1952843051"/>
+            <wp:docPr id="1952843052" name="Picture 1952843052"/>
             <wp:cNvGraphicFramePr>
               <a:graphicFrameLocks noChangeAspect="1"/>
             </wp:cNvGraphicFramePr>
@@ -12815,7 +12867,7 @@
                     <pic:cNvPicPr/>
                   </pic:nvPicPr>
                   <pic:blipFill>
-                    <a:blip r:embed="rId17"/>
+                    <a:blip r:embed="rId18"/>
                     <a:stretch>
                       <a:fillRect/>
                     </a:stretch>
@@ -12848,6 +12900,58 @@
     </w:p>
     <w:p/>
     <w:p>
+      <w:pPr>
+        <w:jc w:val="center"/>
+      </w:pPr>
+      <w:r>
+        <w:drawing>
+          <wp:inline xmlns:a="http://schemas.openxmlformats.org/drawingml/2006/main" xmlns:pic="http://schemas.openxmlformats.org/drawingml/2006/picture">
+            <wp:extent cx="5669280" cy="3543300"/>
+            <wp:docPr id="1952843053" name="Picture 1952843053"/>
+            <wp:cNvGraphicFramePr>
+              <a:graphicFrameLocks noChangeAspect="1"/>
+            </wp:cNvGraphicFramePr>
+            <a:graphic>
+              <a:graphicData uri="http://schemas.openxmlformats.org/drawingml/2006/picture">
+                <pic:pic>
+                  <pic:nvPicPr>
+                    <pic:cNvPr id="0" name="airflow.png"/>
+                    <pic:cNvPicPr/>
+                  </pic:nvPicPr>
+                  <pic:blipFill>
+                    <a:blip r:embed="rId19"/>
+                    <a:stretch>
+                      <a:fillRect/>
+                    </a:stretch>
+                  </pic:blipFill>
+                  <pic:spPr>
+                    <a:xfrm>
+                      <a:off x="0" y="0"/>
+                      <a:ext cx="5669280" cy="3543300"/>
+                    </a:xfrm>
+                    <a:prstGeom prst="rect"/>
+                  </pic:spPr>
+                </pic:pic>
+              </a:graphicData>
+            </a:graphic>
+          </wp:inline>
+        </w:drawing>
+      </w:r>
+    </w:p>
+    <w:p>
+      <w:pPr>
+        <w:jc w:val="center"/>
+      </w:pPr>
+      <w:r>
+        <w:rPr>
+          <w:i/>
+          <w:sz w:val="18"/>
+        </w:rPr>
+        <w:t>Figure 13.5b — Airflow run of nextstay_dbt_elt: seed → run → snapshot → test, all succeeded.</w:t>
+      </w:r>
+    </w:p>
+    <w:p/>
+    <w:p>
       <w:r>
         <w:rPr>
           <w:b w:val="0"/>
@@ -12861,9 +12965,61 @@
         <w:rPr>
           <w:sz w:val="22"/>
         </w:rPr>
-        <w:t>Superset connects to the warehouse and exposes the marts as datasets on the 'NextStay — Hotel Analytics' dashboard: occupancy by date, RevPAR by date, and guest loyalty tiers. [INSERT SCREENSHOT: Superset dashboard from http://localhost:8088 — see notes.]</w:t>
-      </w:r>
-    </w:p>
+        <w:t>Superset connects to the warehouse and exposes the marts as datasets on the 'NextStay — Hotel Analytics' dashboard: occupancy by date, RevPAR by date, and guest loyalty tiers.</w:t>
+      </w:r>
+    </w:p>
+    <w:p>
+      <w:pPr>
+        <w:jc w:val="center"/>
+      </w:pPr>
+      <w:r>
+        <w:drawing>
+          <wp:inline xmlns:a="http://schemas.openxmlformats.org/drawingml/2006/main" xmlns:pic="http://schemas.openxmlformats.org/drawingml/2006/picture">
+            <wp:extent cx="5669280" cy="3543300"/>
+            <wp:docPr id="1952843054" name="Picture 1952843054"/>
+            <wp:cNvGraphicFramePr>
+              <a:graphicFrameLocks noChangeAspect="1"/>
+            </wp:cNvGraphicFramePr>
+            <a:graphic>
+              <a:graphicData uri="http://schemas.openxmlformats.org/drawingml/2006/picture">
+                <pic:pic>
+                  <pic:nvPicPr>
+                    <pic:cNvPr id="0" name="superset.png"/>
+                    <pic:cNvPicPr/>
+                  </pic:nvPicPr>
+                  <pic:blipFill>
+                    <a:blip r:embed="rId20"/>
+                    <a:stretch>
+                      <a:fillRect/>
+                    </a:stretch>
+                  </pic:blipFill>
+                  <pic:spPr>
+                    <a:xfrm>
+                      <a:off x="0" y="0"/>
+                      <a:ext cx="5669280" cy="3543300"/>
+                    </a:xfrm>
+                    <a:prstGeom prst="rect"/>
+                  </pic:spPr>
+                </pic:pic>
+              </a:graphicData>
+            </a:graphic>
+          </wp:inline>
+        </w:drawing>
+      </w:r>
+    </w:p>
+    <w:p>
+      <w:pPr>
+        <w:jc w:val="center"/>
+      </w:pPr>
+      <w:r>
+        <w:rPr>
+          <w:i/>
+          <w:sz w:val="18"/>
+        </w:rPr>
+        <w:t>Figure 13.6 — Superset dashboard 'NextStay — Hotel Analytics' (occupancy, RevPAR, loyalty).</w:t>
+      </w:r>
+    </w:p>
+    <w:p/>
     <w:p>
       <w:r>
         <w:rPr>
@@ -12911,7 +13067,7 @@
         <w:drawing>
           <wp:inline xmlns:a="http://schemas.openxmlformats.org/drawingml/2006/main" xmlns:pic="http://schemas.openxmlformats.org/drawingml/2006/picture">
             <wp:extent cx="5486400" cy="9501809"/>
-            <wp:docPr id="1952843052" name="Picture 1952843052"/>
+            <wp:docPr id="1952843055" name="Picture 1952843055"/>
             <wp:cNvGraphicFramePr>
               <a:graphicFrameLocks noChangeAspect="1"/>
             </wp:cNvGraphicFramePr>
@@ -12923,7 +13079,7 @@
                     <pic:cNvPicPr/>
                   </pic:nvPicPr>
                   <pic:blipFill>
-                    <a:blip r:embed="rId18"/>
+                    <a:blip r:embed="rId21"/>
                     <a:stretch>
                       <a:fillRect/>
                     </a:stretch>

</xml_diff>